<commit_message>
usage and decision log
</commit_message>
<xml_diff>
--- a/CSSE7023_UsageandDecisionLog_Assignment2_v1.0.docx
+++ b/CSSE7023_UsageandDecisionLog_Assignment2_v1.0.docx
@@ -10,10 +10,7 @@
         <w:t>How to Complete the Usage &amp; Decision Log</w:t>
       </w:r>
       <w:r>
-        <w:t xml:space="preserve"> – Block 2 – use </w:t>
-      </w:r>
-      <w:r>
-        <w:t>for Individual Assignment 2</w:t>
+        <w:t xml:space="preserve"> – Block 2 – use for Individual Assignment 2</w:t>
       </w:r>
     </w:p>
     <w:p>
@@ -1242,6 +1239,26 @@
                 <w:lang w:val="en-AU"/>
               </w:rPr>
             </w:pPr>
+            <w:r>
+              <w:rPr>
+                <w:lang w:val="en-AU"/>
+              </w:rPr>
+              <w:t xml:space="preserve">April 12th – May </w:t>
+            </w:r>
+            <w:proofErr w:type="gramStart"/>
+            <w:r>
+              <w:rPr>
+                <w:lang w:val="en-AU"/>
+              </w:rPr>
+              <w:t>23th</w:t>
+            </w:r>
+            <w:proofErr w:type="gramEnd"/>
+            <w:r>
+              <w:rPr>
+                <w:lang w:val="en-AU"/>
+              </w:rPr>
+              <w:t xml:space="preserve"> 2026</w:t>
+            </w:r>
           </w:p>
         </w:tc>
       </w:tr>
@@ -1514,6 +1531,28 @@
           <w:p>
             <w:pPr>
               <w:rPr>
+                <w:sz w:val="18"/>
+                <w:szCs w:val="18"/>
+                <w:lang w:val="en-AU"/>
+              </w:rPr>
+            </w:pPr>
+            <w:r>
+              <w:rPr>
+                <w:sz w:val="18"/>
+                <w:szCs w:val="18"/>
+                <w:lang w:val="en-AU"/>
+              </w:rPr>
+              <w:t>Claude</w:t>
+            </w:r>
+          </w:p>
+        </w:tc>
+        <w:tc>
+          <w:tcPr>
+            <w:tcW w:w="1843" w:type="dxa"/>
+          </w:tcPr>
+          <w:p>
+            <w:pPr>
+              <w:rPr>
                 <w:i/>
                 <w:iCs/>
                 <w:sz w:val="18"/>
@@ -1523,39 +1562,43 @@
             </w:pPr>
             <w:r>
               <w:rPr>
-                <w:i/>
-                <w:iCs/>
-                <w:sz w:val="18"/>
-                <w:szCs w:val="18"/>
-                <w:lang w:val="en-AU"/>
-              </w:rPr>
-              <w:t>Claude</w:t>
-            </w:r>
-          </w:p>
-        </w:tc>
-        <w:tc>
-          <w:tcPr>
-            <w:tcW w:w="1843" w:type="dxa"/>
-          </w:tcPr>
-          <w:p>
-            <w:pPr>
-              <w:rPr>
-                <w:i/>
-                <w:iCs/>
-                <w:sz w:val="18"/>
-                <w:szCs w:val="18"/>
-                <w:lang w:val="en-AU"/>
-              </w:rPr>
-            </w:pPr>
-            <w:r>
-              <w:rPr>
-                <w:i/>
-                <w:iCs/>
-                <w:sz w:val="18"/>
-                <w:szCs w:val="18"/>
-                <w:lang w:val="en-AU"/>
-              </w:rPr>
-              <w:t>Idea Generation / Debugging / Explaining concepts</w:t>
+                <w:sz w:val="18"/>
+                <w:szCs w:val="18"/>
+                <w:lang w:val="en-AU"/>
+              </w:rPr>
+              <w:t xml:space="preserve">AI was used </w:t>
+            </w:r>
+            <w:r>
+              <w:rPr>
+                <w:sz w:val="18"/>
+                <w:szCs w:val="18"/>
+                <w:lang w:val="en-AU"/>
+              </w:rPr>
+              <w:t>to</w:t>
+            </w:r>
+            <w:r>
+              <w:rPr>
+                <w:sz w:val="18"/>
+                <w:szCs w:val="18"/>
+                <w:lang w:val="en-AU"/>
+              </w:rPr>
+              <w:t xml:space="preserve"> assist</w:t>
+            </w:r>
+            <w:r>
+              <w:rPr>
+                <w:sz w:val="18"/>
+                <w:szCs w:val="18"/>
+                <w:lang w:val="en-AU"/>
+              </w:rPr>
+              <w:t xml:space="preserve"> me understanding </w:t>
+            </w:r>
+            <w:r>
+              <w:rPr>
+                <w:sz w:val="18"/>
+                <w:szCs w:val="18"/>
+                <w:lang w:val="en-AU"/>
+              </w:rPr>
+              <w:t xml:space="preserve">some of the logic in the spec </w:t>
             </w:r>
           </w:p>
         </w:tc>
@@ -1566,22 +1609,36 @@
           <w:p>
             <w:pPr>
               <w:rPr>
-                <w:i/>
-                <w:iCs/>
-                <w:sz w:val="18"/>
-                <w:szCs w:val="18"/>
-                <w:lang w:val="en-AU"/>
-              </w:rPr>
-            </w:pPr>
-            <w:r>
-              <w:rPr>
-                <w:i/>
-                <w:iCs/>
-                <w:sz w:val="18"/>
-                <w:szCs w:val="18"/>
-                <w:lang w:val="en-AU"/>
-              </w:rPr>
-              <w:t>Asked for a flexbox layout for a responsive card grid</w:t>
+                <w:sz w:val="18"/>
+                <w:szCs w:val="18"/>
+                <w:lang w:val="en-AU"/>
+              </w:rPr>
+            </w:pPr>
+            <w:r>
+              <w:rPr>
+                <w:sz w:val="18"/>
+                <w:szCs w:val="18"/>
+                <w:lang w:val="en-AU"/>
+              </w:rPr>
+              <w:t xml:space="preserve">I gave the AI some part of the assignment spec, </w:t>
+            </w:r>
+            <w:proofErr w:type="gramStart"/>
+            <w:r>
+              <w:rPr>
+                <w:sz w:val="18"/>
+                <w:szCs w:val="18"/>
+                <w:lang w:val="en-AU"/>
+              </w:rPr>
+              <w:t>and also</w:t>
+            </w:r>
+            <w:proofErr w:type="gramEnd"/>
+            <w:r>
+              <w:rPr>
+                <w:sz w:val="18"/>
+                <w:szCs w:val="18"/>
+                <w:lang w:val="en-AU"/>
+              </w:rPr>
+              <w:t xml:space="preserve"> my understanding regarding some of the key points in a list. There are several prompts following it, mostly about me and AI discussing how the logics should be, and what things need to be confirmed to the teaching team if any. </w:t>
             </w:r>
           </w:p>
         </w:tc>
@@ -1592,22 +1649,72 @@
           <w:p>
             <w:pPr>
               <w:rPr>
-                <w:i/>
-                <w:iCs/>
-                <w:sz w:val="18"/>
-                <w:szCs w:val="18"/>
-                <w:lang w:val="en-AU"/>
-              </w:rPr>
-            </w:pPr>
-            <w:r>
-              <w:rPr>
-                <w:i/>
-                <w:iCs/>
-                <w:sz w:val="18"/>
-                <w:szCs w:val="18"/>
-                <w:lang w:val="en-AU"/>
-              </w:rPr>
-              <w:t>Suggested CSS grid with media queries and example code</w:t>
+                <w:sz w:val="18"/>
+                <w:szCs w:val="18"/>
+                <w:lang w:val="en-AU"/>
+              </w:rPr>
+            </w:pPr>
+            <w:r>
+              <w:rPr>
+                <w:sz w:val="18"/>
+                <w:szCs w:val="18"/>
+                <w:lang w:val="en-AU"/>
+              </w:rPr>
+              <w:t xml:space="preserve">AI gave me example of how some of the logics should </w:t>
+            </w:r>
+            <w:proofErr w:type="gramStart"/>
+            <w:r>
+              <w:rPr>
+                <w:sz w:val="18"/>
+                <w:szCs w:val="18"/>
+                <w:lang w:val="en-AU"/>
+              </w:rPr>
+              <w:t>be, and</w:t>
+            </w:r>
+            <w:proofErr w:type="gramEnd"/>
+            <w:r>
+              <w:rPr>
+                <w:sz w:val="18"/>
+                <w:szCs w:val="18"/>
+                <w:lang w:val="en-AU"/>
+              </w:rPr>
+              <w:t xml:space="preserve"> give a </w:t>
+            </w:r>
+            <w:proofErr w:type="gramStart"/>
+            <w:r>
+              <w:rPr>
+                <w:sz w:val="18"/>
+                <w:szCs w:val="18"/>
+                <w:lang w:val="en-AU"/>
+              </w:rPr>
+              <w:t>“corrections”</w:t>
+            </w:r>
+            <w:proofErr w:type="gramEnd"/>
+            <w:r>
+              <w:rPr>
+                <w:sz w:val="18"/>
+                <w:szCs w:val="18"/>
+                <w:lang w:val="en-AU"/>
+              </w:rPr>
+              <w:t xml:space="preserve"> about my understanding. AI also gave me example of how the venue x room logic plays out, </w:t>
+            </w:r>
+            <w:proofErr w:type="gramStart"/>
+            <w:r>
+              <w:rPr>
+                <w:sz w:val="18"/>
+                <w:szCs w:val="18"/>
+                <w:lang w:val="en-AU"/>
+              </w:rPr>
+              <w:t>and also</w:t>
+            </w:r>
+            <w:proofErr w:type="gramEnd"/>
+            <w:r>
+              <w:rPr>
+                <w:sz w:val="18"/>
+                <w:szCs w:val="18"/>
+                <w:lang w:val="en-AU"/>
+              </w:rPr>
+              <w:t xml:space="preserve"> the desks allocation logics should be.</w:t>
             </w:r>
           </w:p>
         </w:tc>
@@ -1618,22 +1725,72 @@
           <w:p>
             <w:pPr>
               <w:rPr>
-                <w:i/>
-                <w:iCs/>
-                <w:sz w:val="18"/>
-                <w:szCs w:val="18"/>
-                <w:lang w:val="en-AU"/>
-              </w:rPr>
-            </w:pPr>
-            <w:r>
-              <w:rPr>
-                <w:i/>
-                <w:iCs/>
-                <w:sz w:val="18"/>
-                <w:szCs w:val="18"/>
-                <w:lang w:val="en-AU"/>
-              </w:rPr>
-              <w:t>Used largely unchanged, modified before use, used only for reference, rejected</w:t>
+                <w:sz w:val="18"/>
+                <w:szCs w:val="18"/>
+                <w:lang w:val="en-AU"/>
+              </w:rPr>
+            </w:pPr>
+            <w:r>
+              <w:rPr>
+                <w:sz w:val="18"/>
+                <w:szCs w:val="18"/>
+                <w:lang w:val="en-AU"/>
+              </w:rPr>
+              <w:t xml:space="preserve">Claude did not </w:t>
+            </w:r>
+            <w:proofErr w:type="gramStart"/>
+            <w:r>
+              <w:rPr>
+                <w:sz w:val="18"/>
+                <w:szCs w:val="18"/>
+                <w:lang w:val="en-AU"/>
+              </w:rPr>
+              <w:t>gave</w:t>
+            </w:r>
+            <w:proofErr w:type="gramEnd"/>
+            <w:r>
+              <w:rPr>
+                <w:sz w:val="18"/>
+                <w:szCs w:val="18"/>
+                <w:lang w:val="en-AU"/>
+              </w:rPr>
+              <w:t xml:space="preserve"> me code, but I use its explanations, questions, and corrections, as a help for me to understand key parts of the assignment. I am aware that in this part, AI does not have many </w:t>
+            </w:r>
+            <w:proofErr w:type="gramStart"/>
+            <w:r>
+              <w:rPr>
+                <w:sz w:val="18"/>
+                <w:szCs w:val="18"/>
+                <w:lang w:val="en-AU"/>
+              </w:rPr>
+              <w:t>context</w:t>
+            </w:r>
+            <w:proofErr w:type="gramEnd"/>
+            <w:r>
+              <w:rPr>
+                <w:sz w:val="18"/>
+                <w:szCs w:val="18"/>
+                <w:lang w:val="en-AU"/>
+              </w:rPr>
+              <w:t xml:space="preserve"> about the assignment yet, therefore wrong “corrections” often made, but </w:t>
+            </w:r>
+            <w:proofErr w:type="spellStart"/>
+            <w:r>
+              <w:rPr>
+                <w:sz w:val="18"/>
+                <w:szCs w:val="18"/>
+                <w:lang w:val="en-AU"/>
+              </w:rPr>
+              <w:t>its</w:t>
+            </w:r>
+            <w:proofErr w:type="spellEnd"/>
+            <w:r>
+              <w:rPr>
+                <w:sz w:val="18"/>
+                <w:szCs w:val="18"/>
+                <w:lang w:val="en-AU"/>
+              </w:rPr>
+              <w:t xml:space="preserve"> still very useful for challenging my understanding and questions for the teaching team for unclear things in the spec.</w:t>
             </w:r>
           </w:p>
         </w:tc>
@@ -1651,6 +1808,14 @@
                 <w:lang w:val="en-AU"/>
               </w:rPr>
             </w:pPr>
+            <w:r>
+              <w:rPr>
+                <w:sz w:val="18"/>
+                <w:szCs w:val="18"/>
+                <w:lang w:val="en-AU"/>
+              </w:rPr>
+              <w:t>Claude</w:t>
+            </w:r>
           </w:p>
         </w:tc>
         <w:tc>
@@ -1665,6 +1830,70 @@
                 <w:lang w:val="en-AU"/>
               </w:rPr>
             </w:pPr>
+            <w:r>
+              <w:rPr>
+                <w:sz w:val="18"/>
+                <w:szCs w:val="18"/>
+                <w:lang w:val="en-AU"/>
+              </w:rPr>
+              <w:t>I used AI to</w:t>
+            </w:r>
+            <w:r>
+              <w:rPr>
+                <w:sz w:val="18"/>
+                <w:szCs w:val="18"/>
+                <w:lang w:val="en-AU"/>
+              </w:rPr>
+              <w:t xml:space="preserve"> help me better understand</w:t>
+            </w:r>
+            <w:r>
+              <w:rPr>
+                <w:sz w:val="18"/>
+                <w:szCs w:val="18"/>
+                <w:lang w:val="en-AU"/>
+              </w:rPr>
+              <w:t xml:space="preserve"> </w:t>
+            </w:r>
+            <w:r>
+              <w:rPr>
+                <w:sz w:val="18"/>
+                <w:szCs w:val="18"/>
+                <w:lang w:val="en-AU"/>
+              </w:rPr>
+              <w:t xml:space="preserve">some of </w:t>
+            </w:r>
+            <w:r>
+              <w:rPr>
+                <w:sz w:val="18"/>
+                <w:szCs w:val="18"/>
+                <w:lang w:val="en-AU"/>
+              </w:rPr>
+              <w:t>the class and methods</w:t>
+            </w:r>
+            <w:r>
+              <w:rPr>
+                <w:sz w:val="18"/>
+                <w:szCs w:val="18"/>
+                <w:lang w:val="en-AU"/>
+              </w:rPr>
+              <w:t xml:space="preserve"> spec</w:t>
+            </w:r>
+            <w:r>
+              <w:rPr>
+                <w:sz w:val="18"/>
+                <w:szCs w:val="18"/>
+                <w:lang w:val="en-AU"/>
+              </w:rPr>
+              <w:t xml:space="preserve"> in the Javadoc</w:t>
+            </w:r>
+            <w:r>
+              <w:rPr>
+                <w:sz w:val="18"/>
+                <w:szCs w:val="18"/>
+                <w:lang w:val="en-AU"/>
+              </w:rPr>
+              <w:t>.</w:t>
+            </w:r>
           </w:p>
         </w:tc>
         <w:tc>
@@ -1679,6 +1908,50 @@
                 <w:lang w:val="en-AU"/>
               </w:rPr>
             </w:pPr>
+            <w:r>
+              <w:rPr>
+                <w:sz w:val="18"/>
+                <w:szCs w:val="18"/>
+                <w:lang w:val="en-AU"/>
+              </w:rPr>
+              <w:t xml:space="preserve">I gave the AI some part of the </w:t>
+            </w:r>
+            <w:proofErr w:type="spellStart"/>
+            <w:r>
+              <w:rPr>
+                <w:sz w:val="18"/>
+                <w:szCs w:val="18"/>
+                <w:lang w:val="en-AU"/>
+              </w:rPr>
+              <w:t>javadoc</w:t>
+            </w:r>
+            <w:proofErr w:type="spellEnd"/>
+            <w:r>
+              <w:rPr>
+                <w:sz w:val="18"/>
+                <w:szCs w:val="18"/>
+                <w:lang w:val="en-AU"/>
+              </w:rPr>
+              <w:t xml:space="preserve">, </w:t>
+            </w:r>
+            <w:proofErr w:type="gramStart"/>
+            <w:r>
+              <w:rPr>
+                <w:sz w:val="18"/>
+                <w:szCs w:val="18"/>
+                <w:lang w:val="en-AU"/>
+              </w:rPr>
+              <w:t>and also</w:t>
+            </w:r>
+            <w:proofErr w:type="gramEnd"/>
+            <w:r>
+              <w:rPr>
+                <w:sz w:val="18"/>
+                <w:szCs w:val="18"/>
+                <w:lang w:val="en-AU"/>
+              </w:rPr>
+              <w:t xml:space="preserve"> my understanding, therefore the AI can correct my understanding and give explanations and pseudocode to implement the method.</w:t>
+            </w:r>
           </w:p>
         </w:tc>
         <w:tc>
@@ -1693,6 +1966,22 @@
                 <w:lang w:val="en-AU"/>
               </w:rPr>
             </w:pPr>
+            <w:r>
+              <w:rPr>
+                <w:sz w:val="18"/>
+                <w:szCs w:val="18"/>
+                <w:lang w:val="en-AU"/>
+              </w:rPr>
+              <w:t xml:space="preserve">AI gave me explanation in form of guidance and sometimes in pseudocode. </w:t>
+            </w:r>
+            <w:r>
+              <w:rPr>
+                <w:sz w:val="18"/>
+                <w:szCs w:val="18"/>
+                <w:lang w:val="en-AU"/>
+              </w:rPr>
+              <w:t>It also gave me an example of input and output that should be generated from the methods.</w:t>
+            </w:r>
           </w:p>
         </w:tc>
         <w:tc>
@@ -1707,6 +1996,68 @@
                 <w:lang w:val="en-AU"/>
               </w:rPr>
             </w:pPr>
+            <w:r>
+              <w:rPr>
+                <w:sz w:val="18"/>
+                <w:szCs w:val="18"/>
+                <w:lang w:val="en-AU"/>
+              </w:rPr>
+              <w:t xml:space="preserve">The output is used whenever I think the AI might be right and my implementation Is incomplete/wrong. I check this mostly on </w:t>
+            </w:r>
+            <w:proofErr w:type="spellStart"/>
+            <w:r>
+              <w:rPr>
+                <w:sz w:val="18"/>
+                <w:szCs w:val="18"/>
+                <w:lang w:val="en-AU"/>
+              </w:rPr>
+              <w:t>streamin</w:t>
+            </w:r>
+            <w:proofErr w:type="spellEnd"/>
+            <w:r>
+              <w:rPr>
+                <w:sz w:val="18"/>
+                <w:szCs w:val="18"/>
+                <w:lang w:val="en-AU"/>
+              </w:rPr>
+              <w:t>/</w:t>
+            </w:r>
+            <w:proofErr w:type="spellStart"/>
+            <w:r>
+              <w:rPr>
+                <w:sz w:val="18"/>
+                <w:szCs w:val="18"/>
+                <w:lang w:val="en-AU"/>
+              </w:rPr>
+              <w:t>streamout</w:t>
+            </w:r>
+            <w:proofErr w:type="spellEnd"/>
+            <w:r>
+              <w:rPr>
+                <w:sz w:val="18"/>
+                <w:szCs w:val="18"/>
+                <w:lang w:val="en-AU"/>
+              </w:rPr>
+              <w:t xml:space="preserve"> and sanitising logics due to the complex nature of it as the output should be </w:t>
+            </w:r>
+            <w:proofErr w:type="gramStart"/>
+            <w:r>
+              <w:rPr>
+                <w:sz w:val="18"/>
+                <w:szCs w:val="18"/>
+                <w:lang w:val="en-AU"/>
+              </w:rPr>
+              <w:t>exactly correct</w:t>
+            </w:r>
+            <w:proofErr w:type="gramEnd"/>
+            <w:r>
+              <w:rPr>
+                <w:sz w:val="18"/>
+                <w:szCs w:val="18"/>
+                <w:lang w:val="en-AU"/>
+              </w:rPr>
+              <w:t>.</w:t>
+            </w:r>
           </w:p>
         </w:tc>
       </w:tr>
@@ -1723,6 +2074,14 @@
                 <w:lang w:val="en-AU"/>
               </w:rPr>
             </w:pPr>
+            <w:r>
+              <w:rPr>
+                <w:sz w:val="18"/>
+                <w:szCs w:val="18"/>
+                <w:lang w:val="en-AU"/>
+              </w:rPr>
+              <w:t>Claude</w:t>
+            </w:r>
           </w:p>
         </w:tc>
         <w:tc>
@@ -1737,6 +2096,22 @@
                 <w:lang w:val="en-AU"/>
               </w:rPr>
             </w:pPr>
+            <w:r>
+              <w:rPr>
+                <w:sz w:val="18"/>
+                <w:szCs w:val="18"/>
+                <w:lang w:val="en-AU"/>
+              </w:rPr>
+              <w:t xml:space="preserve">I used AI to help me </w:t>
+            </w:r>
+            <w:r>
+              <w:rPr>
+                <w:sz w:val="18"/>
+                <w:szCs w:val="18"/>
+                <w:lang w:val="en-AU"/>
+              </w:rPr>
+              <w:t>build the stubs for the classes</w:t>
+            </w:r>
           </w:p>
         </w:tc>
         <w:tc>
@@ -1751,6 +2126,76 @@
                 <w:lang w:val="en-AU"/>
               </w:rPr>
             </w:pPr>
+            <w:r>
+              <w:rPr>
+                <w:sz w:val="18"/>
+                <w:szCs w:val="18"/>
+                <w:lang w:val="en-AU"/>
+              </w:rPr>
+              <w:t xml:space="preserve">I gave AI the </w:t>
+            </w:r>
+            <w:proofErr w:type="spellStart"/>
+            <w:r>
+              <w:rPr>
+                <w:sz w:val="18"/>
+                <w:szCs w:val="18"/>
+                <w:lang w:val="en-AU"/>
+              </w:rPr>
+              <w:t>javadoc</w:t>
+            </w:r>
+            <w:proofErr w:type="spellEnd"/>
+            <w:r>
+              <w:rPr>
+                <w:sz w:val="18"/>
+                <w:szCs w:val="18"/>
+                <w:lang w:val="en-AU"/>
+              </w:rPr>
+              <w:t xml:space="preserve"> for several of the classes, </w:t>
+            </w:r>
+            <w:proofErr w:type="gramStart"/>
+            <w:r>
+              <w:rPr>
+                <w:sz w:val="18"/>
+                <w:szCs w:val="18"/>
+                <w:lang w:val="en-AU"/>
+              </w:rPr>
+              <w:t>and also</w:t>
+            </w:r>
+            <w:proofErr w:type="gramEnd"/>
+            <w:r>
+              <w:rPr>
+                <w:sz w:val="18"/>
+                <w:szCs w:val="18"/>
+                <w:lang w:val="en-AU"/>
+              </w:rPr>
+              <w:t xml:space="preserve"> a prompt that ask it to help build the stubs (method names and </w:t>
+            </w:r>
+            <w:proofErr w:type="spellStart"/>
+            <w:r>
+              <w:rPr>
+                <w:sz w:val="18"/>
+                <w:szCs w:val="18"/>
+                <w:lang w:val="en-AU"/>
+              </w:rPr>
+              <w:t>javadoc</w:t>
+            </w:r>
+            <w:proofErr w:type="spellEnd"/>
+            <w:r>
+              <w:rPr>
+                <w:sz w:val="18"/>
+                <w:szCs w:val="18"/>
+                <w:lang w:val="en-AU"/>
+              </w:rPr>
+              <w:t xml:space="preserve"> comments</w:t>
+            </w:r>
+            <w:r>
+              <w:rPr>
+                <w:sz w:val="18"/>
+                <w:szCs w:val="18"/>
+                <w:lang w:val="en-AU"/>
+              </w:rPr>
+              <w:t>) without the implementation.</w:t>
+            </w:r>
           </w:p>
         </w:tc>
         <w:tc>
@@ -1765,6 +2210,32 @@
                 <w:lang w:val="en-AU"/>
               </w:rPr>
             </w:pPr>
+            <w:r>
+              <w:rPr>
+                <w:sz w:val="18"/>
+                <w:szCs w:val="18"/>
+                <w:lang w:val="en-AU"/>
+              </w:rPr>
+              <w:t xml:space="preserve">The unimplemented methods (stubs) with the </w:t>
+            </w:r>
+            <w:proofErr w:type="spellStart"/>
+            <w:r>
+              <w:rPr>
+                <w:sz w:val="18"/>
+                <w:szCs w:val="18"/>
+                <w:lang w:val="en-AU"/>
+              </w:rPr>
+              <w:t>javadoc</w:t>
+            </w:r>
+            <w:proofErr w:type="spellEnd"/>
+            <w:r>
+              <w:rPr>
+                <w:sz w:val="18"/>
+                <w:szCs w:val="18"/>
+                <w:lang w:val="en-AU"/>
+              </w:rPr>
+              <w:t xml:space="preserve"> comments</w:t>
+            </w:r>
           </w:p>
         </w:tc>
         <w:tc>
@@ -1779,6 +2250,50 @@
                 <w:lang w:val="en-AU"/>
               </w:rPr>
             </w:pPr>
+            <w:r>
+              <w:rPr>
+                <w:sz w:val="18"/>
+                <w:szCs w:val="18"/>
+                <w:lang w:val="en-AU"/>
+              </w:rPr>
+              <w:t xml:space="preserve">I used it on several classes that have a lot of methods and long </w:t>
+            </w:r>
+            <w:proofErr w:type="spellStart"/>
+            <w:r>
+              <w:rPr>
+                <w:sz w:val="18"/>
+                <w:szCs w:val="18"/>
+                <w:lang w:val="en-AU"/>
+              </w:rPr>
+              <w:t>javadocs</w:t>
+            </w:r>
+            <w:proofErr w:type="spellEnd"/>
+            <w:r>
+              <w:rPr>
+                <w:sz w:val="18"/>
+                <w:szCs w:val="18"/>
+                <w:lang w:val="en-AU"/>
+              </w:rPr>
+              <w:t xml:space="preserve">, to minimize the time it </w:t>
+            </w:r>
+            <w:proofErr w:type="gramStart"/>
+            <w:r>
+              <w:rPr>
+                <w:sz w:val="18"/>
+                <w:szCs w:val="18"/>
+                <w:lang w:val="en-AU"/>
+              </w:rPr>
+              <w:t>take</w:t>
+            </w:r>
+            <w:proofErr w:type="gramEnd"/>
+            <w:r>
+              <w:rPr>
+                <w:sz w:val="18"/>
+                <w:szCs w:val="18"/>
+                <w:lang w:val="en-AU"/>
+              </w:rPr>
+              <w:t xml:space="preserve"> for me to do uncritical work and therefore can focus on the real implementations. </w:t>
+            </w:r>
           </w:p>
         </w:tc>
       </w:tr>
@@ -1795,6 +2310,14 @@
                 <w:lang w:val="en-AU"/>
               </w:rPr>
             </w:pPr>
+            <w:r>
+              <w:rPr>
+                <w:sz w:val="18"/>
+                <w:szCs w:val="18"/>
+                <w:lang w:val="en-AU"/>
+              </w:rPr>
+              <w:t>Claude</w:t>
+            </w:r>
           </w:p>
         </w:tc>
         <w:tc>
@@ -1809,6 +2332,23 @@
                 <w:lang w:val="en-AU"/>
               </w:rPr>
             </w:pPr>
+            <w:r>
+              <w:rPr>
+                <w:sz w:val="18"/>
+                <w:szCs w:val="18"/>
+                <w:lang w:val="en-AU"/>
+              </w:rPr>
+              <w:t xml:space="preserve">I used AI to help me implement the desk allocation algorithm, which inspired from </w:t>
+            </w:r>
+            <w:r>
+              <w:rPr>
+                <w:sz w:val="18"/>
+                <w:szCs w:val="18"/>
+                <w:lang w:val="en-AU"/>
+              </w:rPr>
+              <w:lastRenderedPageBreak/>
+              <w:t>the old original CLI code</w:t>
+            </w:r>
           </w:p>
         </w:tc>
         <w:tc>
@@ -1823,6 +2363,24 @@
                 <w:lang w:val="en-AU"/>
               </w:rPr>
             </w:pPr>
+            <w:r>
+              <w:rPr>
+                <w:sz w:val="18"/>
+                <w:szCs w:val="18"/>
+                <w:lang w:val="en-AU"/>
+              </w:rPr>
+              <w:lastRenderedPageBreak/>
+              <w:t xml:space="preserve">I made a version of desk allocation method which was keep failing with the desk allocation tests that I previously already made. And then gave the AI my </w:t>
+            </w:r>
+            <w:r>
+              <w:rPr>
+                <w:sz w:val="18"/>
+                <w:szCs w:val="18"/>
+                <w:lang w:val="en-AU"/>
+              </w:rPr>
+              <w:lastRenderedPageBreak/>
+              <w:t>implementation and the old CLI code which shares similar implementation.</w:t>
+            </w:r>
           </w:p>
         </w:tc>
         <w:tc>
@@ -1837,6 +2395,42 @@
                 <w:lang w:val="en-AU"/>
               </w:rPr>
             </w:pPr>
+            <w:r>
+              <w:rPr>
+                <w:sz w:val="18"/>
+                <w:szCs w:val="18"/>
+                <w:lang w:val="en-AU"/>
+              </w:rPr>
+              <w:lastRenderedPageBreak/>
+              <w:t xml:space="preserve">AI gave me explanation on edge cases that I missed when compared with the tests and the expected logic from the spec and announcement on BB. It also </w:t>
+            </w:r>
+            <w:proofErr w:type="gramStart"/>
+            <w:r>
+              <w:rPr>
+                <w:sz w:val="18"/>
+                <w:szCs w:val="18"/>
+                <w:lang w:val="en-AU"/>
+              </w:rPr>
+              <w:t>point</w:t>
+            </w:r>
+            <w:proofErr w:type="gramEnd"/>
+            <w:r>
+              <w:rPr>
+                <w:sz w:val="18"/>
+                <w:szCs w:val="18"/>
+                <w:lang w:val="en-AU"/>
+              </w:rPr>
+              <w:t xml:space="preserve"> out that </w:t>
+            </w:r>
+            <w:r>
+              <w:rPr>
+                <w:sz w:val="18"/>
+                <w:szCs w:val="18"/>
+                <w:lang w:val="en-AU"/>
+              </w:rPr>
+              <w:lastRenderedPageBreak/>
+              <w:t>the column gaps logic from the old CLI code can be used, even though the rest of the logic is not applicable. It also gave me some code parts of the logic, especially on handling the “gaps from different exams take priority over intra-exam allocations”.</w:t>
+            </w:r>
           </w:p>
         </w:tc>
         <w:tc>
@@ -1851,6 +2445,42 @@
                 <w:lang w:val="en-AU"/>
               </w:rPr>
             </w:pPr>
+            <w:r>
+              <w:rPr>
+                <w:sz w:val="18"/>
+                <w:szCs w:val="18"/>
+                <w:lang w:val="en-AU"/>
+              </w:rPr>
+              <w:lastRenderedPageBreak/>
+              <w:t xml:space="preserve">The understanding that I got from long discussion with the AI is used by me to create the </w:t>
+            </w:r>
+            <w:proofErr w:type="spellStart"/>
+            <w:r>
+              <w:rPr>
+                <w:sz w:val="18"/>
+                <w:szCs w:val="18"/>
+                <w:lang w:val="en-AU"/>
+              </w:rPr>
+              <w:t>allocateStudents</w:t>
+            </w:r>
+            <w:proofErr w:type="spellEnd"/>
+            <w:r>
+              <w:rPr>
+                <w:sz w:val="18"/>
+                <w:szCs w:val="18"/>
+                <w:lang w:val="en-AU"/>
+              </w:rPr>
+              <w:t xml:space="preserve"> method in session class. Some code generated by the </w:t>
+            </w:r>
+            <w:r>
+              <w:rPr>
+                <w:sz w:val="18"/>
+                <w:szCs w:val="18"/>
+                <w:lang w:val="en-AU"/>
+              </w:rPr>
+              <w:lastRenderedPageBreak/>
+              <w:t>AI also used, especially when I decided to refactor the method into several private methods.</w:t>
+            </w:r>
           </w:p>
         </w:tc>
       </w:tr>
@@ -1867,6 +2497,15 @@
                 <w:lang w:val="en-AU"/>
               </w:rPr>
             </w:pPr>
+            <w:r>
+              <w:rPr>
+                <w:sz w:val="18"/>
+                <w:szCs w:val="18"/>
+                <w:lang w:val="en-AU"/>
+              </w:rPr>
+              <w:lastRenderedPageBreak/>
+              <w:t>Claude</w:t>
+            </w:r>
           </w:p>
         </w:tc>
         <w:tc>
@@ -1881,6 +2520,14 @@
                 <w:lang w:val="en-AU"/>
               </w:rPr>
             </w:pPr>
+            <w:r>
+              <w:rPr>
+                <w:sz w:val="18"/>
+                <w:szCs w:val="18"/>
+                <w:lang w:val="en-AU"/>
+              </w:rPr>
+              <w:t>I used AI to learn and implement some of the regex code</w:t>
+            </w:r>
           </w:p>
         </w:tc>
         <w:tc>
@@ -1895,6 +2542,46 @@
                 <w:lang w:val="en-AU"/>
               </w:rPr>
             </w:pPr>
+            <w:r>
+              <w:rPr>
+                <w:sz w:val="18"/>
+                <w:szCs w:val="18"/>
+                <w:lang w:val="en-AU"/>
+              </w:rPr>
+              <w:t xml:space="preserve">I explain to AI what I was trying to do like “how to </w:t>
+            </w:r>
+            <w:r>
+              <w:rPr>
+                <w:sz w:val="18"/>
+                <w:szCs w:val="18"/>
+                <w:lang w:val="en-AU"/>
+              </w:rPr>
+              <w:t xml:space="preserve">split </w:t>
+            </w:r>
+            <w:r>
+              <w:rPr>
+                <w:sz w:val="18"/>
+                <w:szCs w:val="18"/>
+                <w:lang w:val="en-AU"/>
+              </w:rPr>
+              <w:t xml:space="preserve">by </w:t>
+            </w:r>
+            <w:r>
+              <w:rPr>
+                <w:sz w:val="18"/>
+                <w:szCs w:val="18"/>
+                <w:lang w:val="en-AU"/>
+              </w:rPr>
+              <w:t>period followed by space</w:t>
+            </w:r>
+            <w:r>
+              <w:rPr>
+                <w:sz w:val="18"/>
+                <w:szCs w:val="18"/>
+                <w:lang w:val="en-AU"/>
+              </w:rPr>
+              <w:t>”</w:t>
+            </w:r>
           </w:p>
         </w:tc>
         <w:tc>
@@ -1909,6 +2596,14 @@
                 <w:lang w:val="en-AU"/>
               </w:rPr>
             </w:pPr>
+            <w:r>
+              <w:rPr>
+                <w:sz w:val="18"/>
+                <w:szCs w:val="18"/>
+                <w:lang w:val="en-AU"/>
+              </w:rPr>
+              <w:t xml:space="preserve">AI gave me explanation and snippets on how to create regex code for things like that. </w:t>
+            </w:r>
           </w:p>
         </w:tc>
         <w:tc>
@@ -1923,6 +2618,14 @@
                 <w:lang w:val="en-AU"/>
               </w:rPr>
             </w:pPr>
+            <w:r>
+              <w:rPr>
+                <w:sz w:val="18"/>
+                <w:szCs w:val="18"/>
+                <w:lang w:val="en-AU"/>
+              </w:rPr>
+              <w:t>I mostly used it on sanitation/streaming code to format it as stated in the spec.</w:t>
+            </w:r>
           </w:p>
         </w:tc>
       </w:tr>
@@ -1939,6 +2642,14 @@
                 <w:lang w:val="en-AU"/>
               </w:rPr>
             </w:pPr>
+            <w:r>
+              <w:rPr>
+                <w:sz w:val="18"/>
+                <w:szCs w:val="18"/>
+                <w:lang w:val="en-AU"/>
+              </w:rPr>
+              <w:t>Claude</w:t>
+            </w:r>
           </w:p>
         </w:tc>
         <w:tc>
@@ -1953,6 +2664,14 @@
                 <w:lang w:val="en-AU"/>
               </w:rPr>
             </w:pPr>
+            <w:r>
+              <w:rPr>
+                <w:sz w:val="18"/>
+                <w:szCs w:val="18"/>
+                <w:lang w:val="en-AU"/>
+              </w:rPr>
+              <w:t>I used AI to help me critically assess the strength of my black box testings</w:t>
+            </w:r>
           </w:p>
         </w:tc>
         <w:tc>
@@ -1967,6 +2686,14 @@
                 <w:lang w:val="en-AU"/>
               </w:rPr>
             </w:pPr>
+            <w:r>
+              <w:rPr>
+                <w:sz w:val="18"/>
+                <w:szCs w:val="18"/>
+                <w:lang w:val="en-AU"/>
+              </w:rPr>
+              <w:t xml:space="preserve">I made a list of black box testings for a class and its methods. I gave the AI my list to assess does the testings are valuable and are there any edge cases that I missed. </w:t>
+            </w:r>
           </w:p>
         </w:tc>
         <w:tc>
@@ -1981,6 +2708,32 @@
                 <w:lang w:val="en-AU"/>
               </w:rPr>
             </w:pPr>
+            <w:r>
+              <w:rPr>
+                <w:sz w:val="18"/>
+                <w:szCs w:val="18"/>
+                <w:lang w:val="en-AU"/>
+              </w:rPr>
+              <w:t xml:space="preserve">AI gave me suggestions on what cases need to be removed/added based on my list. AI also gave me code example for some of the complex testings </w:t>
+            </w:r>
+            <w:proofErr w:type="gramStart"/>
+            <w:r>
+              <w:rPr>
+                <w:sz w:val="18"/>
+                <w:szCs w:val="18"/>
+                <w:lang w:val="en-AU"/>
+              </w:rPr>
+              <w:t>in order for</w:t>
+            </w:r>
+            <w:proofErr w:type="gramEnd"/>
+            <w:r>
+              <w:rPr>
+                <w:sz w:val="18"/>
+                <w:szCs w:val="18"/>
+                <w:lang w:val="en-AU"/>
+              </w:rPr>
+              <w:t xml:space="preserve"> me to understand the edge cases. </w:t>
+            </w:r>
           </w:p>
         </w:tc>
         <w:tc>
@@ -1995,6 +2748,14 @@
                 <w:lang w:val="en-AU"/>
               </w:rPr>
             </w:pPr>
+            <w:r>
+              <w:rPr>
+                <w:sz w:val="18"/>
+                <w:szCs w:val="18"/>
+                <w:lang w:val="en-AU"/>
+              </w:rPr>
+              <w:t xml:space="preserve">I used the testing cases that were suggested by the AI. I also used parts of the code generated by the AI for some complex testing, such as the desk allocation testings. </w:t>
+            </w:r>
           </w:p>
         </w:tc>
       </w:tr>
@@ -2011,6 +2772,14 @@
                 <w:lang w:val="en-AU"/>
               </w:rPr>
             </w:pPr>
+            <w:r>
+              <w:rPr>
+                <w:sz w:val="18"/>
+                <w:szCs w:val="18"/>
+                <w:lang w:val="en-AU"/>
+              </w:rPr>
+              <w:t>Claude</w:t>
+            </w:r>
           </w:p>
         </w:tc>
         <w:tc>
@@ -2025,6 +2794,14 @@
                 <w:lang w:val="en-AU"/>
               </w:rPr>
             </w:pPr>
+            <w:r>
+              <w:rPr>
+                <w:sz w:val="18"/>
+                <w:szCs w:val="18"/>
+                <w:lang w:val="en-AU"/>
+              </w:rPr>
+              <w:t>I used AI to help me strengthen the test for desk allocation algorithm</w:t>
+            </w:r>
           </w:p>
         </w:tc>
         <w:tc>
@@ -2039,6 +2816,32 @@
                 <w:lang w:val="en-AU"/>
               </w:rPr>
             </w:pPr>
+            <w:r>
+              <w:rPr>
+                <w:sz w:val="18"/>
+                <w:szCs w:val="18"/>
+                <w:lang w:val="en-AU"/>
+              </w:rPr>
+              <w:t xml:space="preserve">I gave AI my understanding, the desk allocation logic from the spec, </w:t>
+            </w:r>
+            <w:proofErr w:type="gramStart"/>
+            <w:r>
+              <w:rPr>
+                <w:sz w:val="18"/>
+                <w:szCs w:val="18"/>
+                <w:lang w:val="en-AU"/>
+              </w:rPr>
+              <w:t>and also</w:t>
+            </w:r>
+            <w:proofErr w:type="gramEnd"/>
+            <w:r>
+              <w:rPr>
+                <w:sz w:val="18"/>
+                <w:szCs w:val="18"/>
+                <w:lang w:val="en-AU"/>
+              </w:rPr>
+              <w:t xml:space="preserve"> the announcement in BB regarding how to handle the logics. </w:t>
+            </w:r>
           </w:p>
         </w:tc>
         <w:tc>
@@ -2053,6 +2856,32 @@
                 <w:lang w:val="en-AU"/>
               </w:rPr>
             </w:pPr>
+            <w:r>
+              <w:rPr>
+                <w:sz w:val="18"/>
+                <w:szCs w:val="18"/>
+                <w:lang w:val="en-AU"/>
+              </w:rPr>
+              <w:t xml:space="preserve">AI critically assess my understanding, give corrections, </w:t>
+            </w:r>
+            <w:proofErr w:type="gramStart"/>
+            <w:r>
+              <w:rPr>
+                <w:sz w:val="18"/>
+                <w:szCs w:val="18"/>
+                <w:lang w:val="en-AU"/>
+              </w:rPr>
+              <w:t>and also</w:t>
+            </w:r>
+            <w:proofErr w:type="gramEnd"/>
+            <w:r>
+              <w:rPr>
+                <w:sz w:val="18"/>
+                <w:szCs w:val="18"/>
+                <w:lang w:val="en-AU"/>
+              </w:rPr>
+              <w:t xml:space="preserve"> gave me suggestions on how to strengthen the tests for desk allocations logic. </w:t>
+            </w:r>
           </w:p>
         </w:tc>
         <w:tc>
@@ -2067,6 +2896,32 @@
                 <w:lang w:val="en-AU"/>
               </w:rPr>
             </w:pPr>
+            <w:r>
+              <w:rPr>
+                <w:sz w:val="18"/>
+                <w:szCs w:val="18"/>
+                <w:lang w:val="en-AU"/>
+              </w:rPr>
+              <w:t xml:space="preserve">AI gave me the holes in my </w:t>
+            </w:r>
+            <w:proofErr w:type="gramStart"/>
+            <w:r>
+              <w:rPr>
+                <w:sz w:val="18"/>
+                <w:szCs w:val="18"/>
+                <w:lang w:val="en-AU"/>
+              </w:rPr>
+              <w:t>testings, and</w:t>
+            </w:r>
+            <w:proofErr w:type="gramEnd"/>
+            <w:r>
+              <w:rPr>
+                <w:sz w:val="18"/>
+                <w:szCs w:val="18"/>
+                <w:lang w:val="en-AU"/>
+              </w:rPr>
+              <w:t xml:space="preserve"> gave me suggestions and pseudocodes on how to strengthen my desk allocation tests.</w:t>
+            </w:r>
           </w:p>
         </w:tc>
       </w:tr>
@@ -2083,6 +2938,14 @@
                 <w:lang w:val="en-AU"/>
               </w:rPr>
             </w:pPr>
+            <w:r>
+              <w:rPr>
+                <w:sz w:val="18"/>
+                <w:szCs w:val="18"/>
+                <w:lang w:val="en-AU"/>
+              </w:rPr>
+              <w:t>Claude</w:t>
+            </w:r>
           </w:p>
         </w:tc>
         <w:tc>
@@ -2097,6 +2960,14 @@
                 <w:lang w:val="en-AU"/>
               </w:rPr>
             </w:pPr>
+            <w:r>
+              <w:rPr>
+                <w:sz w:val="18"/>
+                <w:szCs w:val="18"/>
+                <w:lang w:val="en-AU"/>
+              </w:rPr>
+              <w:t>I used AI to help me better understand how the given code work, and what has been provided to us and how to integrate it</w:t>
+            </w:r>
           </w:p>
         </w:tc>
         <w:tc>
@@ -2111,6 +2982,30 @@
                 <w:lang w:val="en-AU"/>
               </w:rPr>
             </w:pPr>
+            <w:r>
+              <w:rPr>
+                <w:sz w:val="18"/>
+                <w:szCs w:val="18"/>
+                <w:lang w:val="en-AU"/>
+              </w:rPr>
+              <w:t xml:space="preserve">I gave AI some of the provided code which I think very important for me to understand but quite hard for me to understand it either, such as the given </w:t>
+            </w:r>
+            <w:r>
+              <w:rPr>
+                <w:sz w:val="18"/>
+                <w:szCs w:val="18"/>
+                <w:lang w:val="en-AU"/>
+              </w:rPr>
+              <w:t>Registry</w:t>
+            </w:r>
+            <w:r>
+              <w:rPr>
+                <w:sz w:val="18"/>
+                <w:szCs w:val="18"/>
+                <w:lang w:val="en-AU"/>
+              </w:rPr>
+              <w:t xml:space="preserve"> class.</w:t>
+            </w:r>
           </w:p>
         </w:tc>
         <w:tc>
@@ -2125,6 +3020,14 @@
                 <w:lang w:val="en-AU"/>
               </w:rPr>
             </w:pPr>
+            <w:r>
+              <w:rPr>
+                <w:sz w:val="18"/>
+                <w:szCs w:val="18"/>
+                <w:lang w:val="en-AU"/>
+              </w:rPr>
+              <w:t>AI gave me explanation on what is the registry and how it should be integrated along with the other models.</w:t>
+            </w:r>
           </w:p>
         </w:tc>
         <w:tc>
@@ -2139,6 +3042,14 @@
                 <w:lang w:val="en-AU"/>
               </w:rPr>
             </w:pPr>
+            <w:r>
+              <w:rPr>
+                <w:sz w:val="18"/>
+                <w:szCs w:val="18"/>
+                <w:lang w:val="en-AU"/>
+              </w:rPr>
+              <w:t>The understanding I got from the explanation is used for me to implement the methods that interact with the registry.</w:t>
+            </w:r>
           </w:p>
         </w:tc>
       </w:tr>
@@ -2155,6 +3066,14 @@
                 <w:lang w:val="en-AU"/>
               </w:rPr>
             </w:pPr>
+            <w:r>
+              <w:rPr>
+                <w:sz w:val="18"/>
+                <w:szCs w:val="18"/>
+                <w:lang w:val="en-AU"/>
+              </w:rPr>
+              <w:t>Claude</w:t>
+            </w:r>
           </w:p>
         </w:tc>
         <w:tc>
@@ -2169,6 +3088,14 @@
                 <w:lang w:val="en-AU"/>
               </w:rPr>
             </w:pPr>
+            <w:r>
+              <w:rPr>
+                <w:sz w:val="18"/>
+                <w:szCs w:val="18"/>
+                <w:lang w:val="en-AU"/>
+              </w:rPr>
+              <w:t>I used AI to help me to learn and implement the GUI code (java swing)</w:t>
+            </w:r>
           </w:p>
         </w:tc>
         <w:tc>
@@ -2183,6 +3110,14 @@
                 <w:lang w:val="en-AU"/>
               </w:rPr>
             </w:pPr>
+            <w:r>
+              <w:rPr>
+                <w:sz w:val="18"/>
+                <w:szCs w:val="18"/>
+                <w:lang w:val="en-AU"/>
+              </w:rPr>
+              <w:t>I ask AI how to structure java swing views, and what key syntaxes can be used in this case. I basically use AI as a search engine in this case.</w:t>
+            </w:r>
           </w:p>
         </w:tc>
         <w:tc>
@@ -2197,6 +3132,32 @@
                 <w:lang w:val="en-AU"/>
               </w:rPr>
             </w:pPr>
+            <w:r>
+              <w:rPr>
+                <w:sz w:val="18"/>
+                <w:szCs w:val="18"/>
+                <w:lang w:val="en-AU"/>
+              </w:rPr>
+              <w:t xml:space="preserve">AI guide me on building some parts of the </w:t>
+            </w:r>
+            <w:proofErr w:type="gramStart"/>
+            <w:r>
+              <w:rPr>
+                <w:sz w:val="18"/>
+                <w:szCs w:val="18"/>
+                <w:lang w:val="en-AU"/>
+              </w:rPr>
+              <w:t>GUI, and</w:t>
+            </w:r>
+            <w:proofErr w:type="gramEnd"/>
+            <w:r>
+              <w:rPr>
+                <w:sz w:val="18"/>
+                <w:szCs w:val="18"/>
+                <w:lang w:val="en-AU"/>
+              </w:rPr>
+              <w:t xml:space="preserve"> help me debug on GUI related bugs.</w:t>
+            </w:r>
           </w:p>
         </w:tc>
         <w:tc>
@@ -2211,6 +3172,32 @@
                 <w:lang w:val="en-AU"/>
               </w:rPr>
             </w:pPr>
+            <w:r>
+              <w:rPr>
+                <w:sz w:val="18"/>
+                <w:szCs w:val="18"/>
+                <w:lang w:val="en-AU"/>
+              </w:rPr>
+              <w:t xml:space="preserve">Several parts of the main view class </w:t>
+            </w:r>
+            <w:proofErr w:type="gramStart"/>
+            <w:r>
+              <w:rPr>
+                <w:sz w:val="18"/>
+                <w:szCs w:val="18"/>
+                <w:lang w:val="en-AU"/>
+              </w:rPr>
+              <w:t>is</w:t>
+            </w:r>
+            <w:proofErr w:type="gramEnd"/>
+            <w:r>
+              <w:rPr>
+                <w:sz w:val="18"/>
+                <w:szCs w:val="18"/>
+                <w:lang w:val="en-AU"/>
+              </w:rPr>
+              <w:t xml:space="preserve"> implemented by me with the help of the guidance of AI.</w:t>
+            </w:r>
           </w:p>
         </w:tc>
       </w:tr>
@@ -2227,6 +3214,14 @@
                 <w:lang w:val="en-AU"/>
               </w:rPr>
             </w:pPr>
+            <w:r>
+              <w:rPr>
+                <w:sz w:val="18"/>
+                <w:szCs w:val="18"/>
+                <w:lang w:val="en-AU"/>
+              </w:rPr>
+              <w:t>Claude</w:t>
+            </w:r>
           </w:p>
         </w:tc>
         <w:tc>
@@ -2241,6 +3236,14 @@
                 <w:lang w:val="en-AU"/>
               </w:rPr>
             </w:pPr>
+            <w:r>
+              <w:rPr>
+                <w:sz w:val="18"/>
+                <w:szCs w:val="18"/>
+                <w:lang w:val="en-AU"/>
+              </w:rPr>
+              <w:t>I used AI to help me debug the code to solve some bugs</w:t>
+            </w:r>
           </w:p>
         </w:tc>
         <w:tc>
@@ -2255,6 +3258,66 @@
                 <w:lang w:val="en-AU"/>
               </w:rPr>
             </w:pPr>
+            <w:r>
+              <w:rPr>
+                <w:sz w:val="18"/>
+                <w:szCs w:val="18"/>
+                <w:lang w:val="en-AU"/>
+              </w:rPr>
+              <w:t xml:space="preserve">I gave AI stack traces of errors I </w:t>
+            </w:r>
+            <w:proofErr w:type="gramStart"/>
+            <w:r>
+              <w:rPr>
+                <w:sz w:val="18"/>
+                <w:szCs w:val="18"/>
+                <w:lang w:val="en-AU"/>
+              </w:rPr>
+              <w:t>encountered, and</w:t>
+            </w:r>
+            <w:proofErr w:type="gramEnd"/>
+            <w:r>
+              <w:rPr>
+                <w:sz w:val="18"/>
+                <w:szCs w:val="18"/>
+                <w:lang w:val="en-AU"/>
+              </w:rPr>
+              <w:t xml:space="preserve"> help me investigate on where it might </w:t>
+            </w:r>
+            <w:proofErr w:type="gramStart"/>
+            <w:r>
+              <w:rPr>
+                <w:sz w:val="18"/>
+                <w:szCs w:val="18"/>
+                <w:lang w:val="en-AU"/>
+              </w:rPr>
+              <w:t>went</w:t>
+            </w:r>
+            <w:proofErr w:type="gramEnd"/>
+            <w:r>
+              <w:rPr>
+                <w:sz w:val="18"/>
+                <w:szCs w:val="18"/>
+                <w:lang w:val="en-AU"/>
+              </w:rPr>
+              <w:t xml:space="preserve"> </w:t>
+            </w:r>
+            <w:r>
+              <w:rPr>
+                <w:sz w:val="18"/>
+                <w:szCs w:val="18"/>
+                <w:lang w:val="en-AU"/>
+              </w:rPr>
+              <w:t>wrong</w:t>
+            </w:r>
+            <w:r>
+              <w:rPr>
+                <w:sz w:val="18"/>
+                <w:szCs w:val="18"/>
+                <w:lang w:val="en-AU"/>
+              </w:rPr>
+              <w:t>.</w:t>
+            </w:r>
           </w:p>
         </w:tc>
         <w:tc>
@@ -2269,6 +3332,32 @@
                 <w:lang w:val="en-AU"/>
               </w:rPr>
             </w:pPr>
+            <w:r>
+              <w:rPr>
+                <w:sz w:val="18"/>
+                <w:szCs w:val="18"/>
+                <w:lang w:val="en-AU"/>
+              </w:rPr>
+              <w:t xml:space="preserve">AI gave me some analysis on what it might go </w:t>
+            </w:r>
+            <w:proofErr w:type="gramStart"/>
+            <w:r>
+              <w:rPr>
+                <w:sz w:val="18"/>
+                <w:szCs w:val="18"/>
+                <w:lang w:val="en-AU"/>
+              </w:rPr>
+              <w:t>wrong, and</w:t>
+            </w:r>
+            <w:proofErr w:type="gramEnd"/>
+            <w:r>
+              <w:rPr>
+                <w:sz w:val="18"/>
+                <w:szCs w:val="18"/>
+                <w:lang w:val="en-AU"/>
+              </w:rPr>
+              <w:t xml:space="preserve"> pinpoint me what methods might be faulty. </w:t>
+            </w:r>
           </w:p>
         </w:tc>
         <w:tc>
@@ -2283,6 +3372,14 @@
                 <w:lang w:val="en-AU"/>
               </w:rPr>
             </w:pPr>
+            <w:r>
+              <w:rPr>
+                <w:sz w:val="18"/>
+                <w:szCs w:val="18"/>
+                <w:lang w:val="en-AU"/>
+              </w:rPr>
+              <w:t>It helped me on resolving the bugs I encountered</w:t>
+            </w:r>
           </w:p>
         </w:tc>
       </w:tr>
@@ -2299,6 +3396,14 @@
                 <w:lang w:val="en-AU"/>
               </w:rPr>
             </w:pPr>
+            <w:r>
+              <w:rPr>
+                <w:sz w:val="18"/>
+                <w:szCs w:val="18"/>
+                <w:lang w:val="en-AU"/>
+              </w:rPr>
+              <w:t>Claude</w:t>
+            </w:r>
           </w:p>
         </w:tc>
         <w:tc>
@@ -2313,6 +3418,14 @@
                 <w:lang w:val="en-AU"/>
               </w:rPr>
             </w:pPr>
+            <w:r>
+              <w:rPr>
+                <w:sz w:val="18"/>
+                <w:szCs w:val="18"/>
+                <w:lang w:val="en-AU"/>
+              </w:rPr>
+              <w:t xml:space="preserve">I used AI to help me give feedback on code readability and code design. </w:t>
+            </w:r>
           </w:p>
         </w:tc>
         <w:tc>
@@ -2327,6 +3440,14 @@
                 <w:lang w:val="en-AU"/>
               </w:rPr>
             </w:pPr>
+            <w:r>
+              <w:rPr>
+                <w:sz w:val="18"/>
+                <w:szCs w:val="18"/>
+                <w:lang w:val="en-AU"/>
+              </w:rPr>
+              <w:t>I gave AI some parts of my code which I think can be improved in regards of readability and structure.</w:t>
+            </w:r>
           </w:p>
         </w:tc>
         <w:tc>
@@ -2341,6 +3462,14 @@
                 <w:lang w:val="en-AU"/>
               </w:rPr>
             </w:pPr>
+            <w:r>
+              <w:rPr>
+                <w:sz w:val="18"/>
+                <w:szCs w:val="18"/>
+                <w:lang w:val="en-AU"/>
+              </w:rPr>
+              <w:t xml:space="preserve">AI gave suggestions on how to improve the methods such as by refactoring it to several private methods, renaming some variables, and other things to make sure I implement the best practice. </w:t>
+            </w:r>
           </w:p>
         </w:tc>
         <w:tc>
@@ -2355,6 +3484,212 @@
                 <w:lang w:val="en-AU"/>
               </w:rPr>
             </w:pPr>
+            <w:r>
+              <w:rPr>
+                <w:sz w:val="18"/>
+                <w:szCs w:val="18"/>
+                <w:lang w:val="en-AU"/>
+              </w:rPr>
+              <w:t xml:space="preserve">It helped me to make sure long or not-so-straightforward logics can be decomposed into a </w:t>
+            </w:r>
+            <w:proofErr w:type="gramStart"/>
+            <w:r>
+              <w:rPr>
+                <w:sz w:val="18"/>
+                <w:szCs w:val="18"/>
+                <w:lang w:val="en-AU"/>
+              </w:rPr>
+              <w:t>more readable methods</w:t>
+            </w:r>
+            <w:proofErr w:type="gramEnd"/>
+            <w:r>
+              <w:rPr>
+                <w:sz w:val="18"/>
+                <w:szCs w:val="18"/>
+                <w:lang w:val="en-AU"/>
+              </w:rPr>
+              <w:t>.</w:t>
+            </w:r>
+          </w:p>
+        </w:tc>
+      </w:tr>
+      <w:tr>
+        <w:tc>
+          <w:tcPr>
+            <w:tcW w:w="1696" w:type="dxa"/>
+          </w:tcPr>
+          <w:p>
+            <w:pPr>
+              <w:rPr>
+                <w:sz w:val="18"/>
+                <w:szCs w:val="18"/>
+                <w:lang w:val="en-AU"/>
+              </w:rPr>
+            </w:pPr>
+            <w:r>
+              <w:rPr>
+                <w:sz w:val="18"/>
+                <w:szCs w:val="18"/>
+                <w:lang w:val="en-AU"/>
+              </w:rPr>
+              <w:t>Claude</w:t>
+            </w:r>
+          </w:p>
+        </w:tc>
+        <w:tc>
+          <w:tcPr>
+            <w:tcW w:w="1843" w:type="dxa"/>
+          </w:tcPr>
+          <w:p>
+            <w:pPr>
+              <w:rPr>
+                <w:sz w:val="18"/>
+                <w:szCs w:val="18"/>
+                <w:lang w:val="en-AU"/>
+              </w:rPr>
+            </w:pPr>
+            <w:r>
+              <w:rPr>
+                <w:sz w:val="18"/>
+                <w:szCs w:val="18"/>
+                <w:lang w:val="en-AU"/>
+              </w:rPr>
+              <w:t xml:space="preserve">I used AI to help me review </w:t>
+            </w:r>
+            <w:proofErr w:type="spellStart"/>
+            <w:r>
+              <w:rPr>
+                <w:sz w:val="18"/>
+                <w:szCs w:val="18"/>
+                <w:lang w:val="en-AU"/>
+              </w:rPr>
+              <w:t>javadoc</w:t>
+            </w:r>
+            <w:proofErr w:type="spellEnd"/>
+            <w:r>
+              <w:rPr>
+                <w:sz w:val="18"/>
+                <w:szCs w:val="18"/>
+                <w:lang w:val="en-AU"/>
+              </w:rPr>
+              <w:t xml:space="preserve"> and inline </w:t>
+            </w:r>
+            <w:r>
+              <w:rPr>
+                <w:sz w:val="18"/>
+                <w:szCs w:val="18"/>
+                <w:lang w:val="en-AU"/>
+              </w:rPr>
+              <w:t xml:space="preserve">comments </w:t>
+            </w:r>
+            <w:r>
+              <w:rPr>
+                <w:sz w:val="18"/>
+                <w:szCs w:val="18"/>
+                <w:lang w:val="en-AU"/>
+              </w:rPr>
+              <w:t>clarity</w:t>
+            </w:r>
+          </w:p>
+        </w:tc>
+        <w:tc>
+          <w:tcPr>
+            <w:tcW w:w="3827" w:type="dxa"/>
+          </w:tcPr>
+          <w:p>
+            <w:pPr>
+              <w:rPr>
+                <w:sz w:val="18"/>
+                <w:szCs w:val="18"/>
+                <w:lang w:val="en-AU"/>
+              </w:rPr>
+            </w:pPr>
+            <w:r>
+              <w:rPr>
+                <w:sz w:val="18"/>
+                <w:szCs w:val="18"/>
+                <w:lang w:val="en-AU"/>
+              </w:rPr>
+              <w:t xml:space="preserve">I gave AI some parts of the code that I think might be not so readable by other </w:t>
+            </w:r>
+            <w:proofErr w:type="gramStart"/>
+            <w:r>
+              <w:rPr>
+                <w:sz w:val="18"/>
+                <w:szCs w:val="18"/>
+                <w:lang w:val="en-AU"/>
+              </w:rPr>
+              <w:t>programmers, and</w:t>
+            </w:r>
+            <w:proofErr w:type="gramEnd"/>
+            <w:r>
+              <w:rPr>
+                <w:sz w:val="18"/>
+                <w:szCs w:val="18"/>
+                <w:lang w:val="en-AU"/>
+              </w:rPr>
+              <w:t xml:space="preserve"> consider whether inline comments might be needed/not. </w:t>
+            </w:r>
+          </w:p>
+        </w:tc>
+        <w:tc>
+          <w:tcPr>
+            <w:tcW w:w="3827" w:type="dxa"/>
+          </w:tcPr>
+          <w:p>
+            <w:pPr>
+              <w:rPr>
+                <w:sz w:val="18"/>
+                <w:szCs w:val="18"/>
+                <w:lang w:val="en-AU"/>
+              </w:rPr>
+            </w:pPr>
+            <w:r>
+              <w:rPr>
+                <w:sz w:val="18"/>
+                <w:szCs w:val="18"/>
+                <w:lang w:val="en-AU"/>
+              </w:rPr>
+              <w:t xml:space="preserve">AI gave me suggestions on when to add/not to add inline comments in some parts of the code. </w:t>
+            </w:r>
+          </w:p>
+        </w:tc>
+        <w:tc>
+          <w:tcPr>
+            <w:tcW w:w="3828" w:type="dxa"/>
+          </w:tcPr>
+          <w:p>
+            <w:pPr>
+              <w:rPr>
+                <w:sz w:val="18"/>
+                <w:szCs w:val="18"/>
+                <w:lang w:val="en-AU"/>
+              </w:rPr>
+            </w:pPr>
+            <w:r>
+              <w:rPr>
+                <w:sz w:val="18"/>
+                <w:szCs w:val="18"/>
+                <w:lang w:val="en-AU"/>
+              </w:rPr>
+              <w:t xml:space="preserve">I used it to make sure my inline comments are placed </w:t>
+            </w:r>
+            <w:r>
+              <w:rPr>
+                <w:sz w:val="18"/>
+                <w:szCs w:val="18"/>
+                <w:lang w:val="en-AU"/>
+              </w:rPr>
+              <w:t>effectively</w:t>
+            </w:r>
+            <w:r>
+              <w:rPr>
+                <w:sz w:val="18"/>
+                <w:szCs w:val="18"/>
+                <w:lang w:val="en-AU"/>
+              </w:rPr>
+              <w:t>, not so much but just enough to help other programmers to understand the flow of the code easier.</w:t>
+            </w:r>
           </w:p>
         </w:tc>
       </w:tr>
@@ -2554,8 +3889,8 @@
         <w:tblLook w:val="04A0" w:firstRow="1" w:lastRow="0" w:firstColumn="1" w:lastColumn="0" w:noHBand="0" w:noVBand="1"/>
       </w:tblPr>
       <w:tblGrid>
-        <w:gridCol w:w="2338"/>
-        <w:gridCol w:w="4997"/>
+        <w:gridCol w:w="2278"/>
+        <w:gridCol w:w="5057"/>
       </w:tblGrid>
       <w:tr>
         <w:tc>
@@ -2634,6 +3969,30 @@
                 <w:lang w:val="en-AU"/>
               </w:rPr>
             </w:pPr>
+            <w:r>
+              <w:rPr>
+                <w:sz w:val="20"/>
+                <w:szCs w:val="20"/>
+                <w:lang w:val="en-AU"/>
+              </w:rPr>
+              <w:t xml:space="preserve">I was trying to understand and implement the desk/student allocation logic, including the intra-exam, column gaps, </w:t>
+            </w:r>
+            <w:r>
+              <w:rPr>
+                <w:sz w:val="20"/>
+                <w:szCs w:val="20"/>
+                <w:lang w:val="en-AU"/>
+              </w:rPr>
+              <w:t xml:space="preserve">clashes, </w:t>
+            </w:r>
+            <w:r>
+              <w:rPr>
+                <w:sz w:val="20"/>
+                <w:szCs w:val="20"/>
+                <w:lang w:val="en-AU"/>
+              </w:rPr>
+              <w:t>and inter-exam gaps logic.</w:t>
+            </w:r>
           </w:p>
         </w:tc>
       </w:tr>
@@ -2654,8 +4013,8 @@
         <w:tblLook w:val="04A0" w:firstRow="1" w:lastRow="0" w:firstColumn="1" w:lastColumn="0" w:noHBand="0" w:noVBand="1"/>
       </w:tblPr>
       <w:tblGrid>
-        <w:gridCol w:w="2363"/>
-        <w:gridCol w:w="4972"/>
+        <w:gridCol w:w="2291"/>
+        <w:gridCol w:w="5044"/>
       </w:tblGrid>
       <w:tr>
         <w:tc>
@@ -2734,6 +4093,104 @@
                 <w:lang w:val="en-AU"/>
               </w:rPr>
             </w:pPr>
+            <w:r>
+              <w:rPr>
+                <w:sz w:val="20"/>
+                <w:szCs w:val="20"/>
+                <w:lang w:val="en-AU"/>
+              </w:rPr>
+              <w:t xml:space="preserve">Before starting to code it, I consider </w:t>
+            </w:r>
+            <w:proofErr w:type="gramStart"/>
+            <w:r>
+              <w:rPr>
+                <w:sz w:val="20"/>
+                <w:szCs w:val="20"/>
+                <w:lang w:val="en-AU"/>
+              </w:rPr>
+              <w:t>to use</w:t>
+            </w:r>
+            <w:proofErr w:type="gramEnd"/>
+            <w:r>
+              <w:rPr>
+                <w:sz w:val="20"/>
+                <w:szCs w:val="20"/>
+                <w:lang w:val="en-AU"/>
+              </w:rPr>
+              <w:t xml:space="preserve"> AI at first to strengthen my understanding on how the logic should be/shouldn’t be before I implement it. Before I consider it, I tried to understand it myself first, including asking questions to the teaching team in ed discussion. I also used AI to check my own implementation of the </w:t>
+            </w:r>
+            <w:proofErr w:type="gramStart"/>
+            <w:r>
+              <w:rPr>
+                <w:sz w:val="20"/>
+                <w:szCs w:val="20"/>
+                <w:lang w:val="en-AU"/>
+              </w:rPr>
+              <w:t>algo, and</w:t>
+            </w:r>
+            <w:proofErr w:type="gramEnd"/>
+            <w:r>
+              <w:rPr>
+                <w:sz w:val="20"/>
+                <w:szCs w:val="20"/>
+                <w:lang w:val="en-AU"/>
+              </w:rPr>
+              <w:t xml:space="preserve"> then use it to guide me on how </w:t>
+            </w:r>
+            <w:proofErr w:type="gramStart"/>
+            <w:r>
+              <w:rPr>
+                <w:sz w:val="20"/>
+                <w:szCs w:val="20"/>
+                <w:lang w:val="en-AU"/>
+              </w:rPr>
+              <w:t>can it</w:t>
+            </w:r>
+            <w:proofErr w:type="gramEnd"/>
+            <w:r>
+              <w:rPr>
+                <w:sz w:val="20"/>
+                <w:szCs w:val="20"/>
+                <w:lang w:val="en-AU"/>
+              </w:rPr>
+              <w:t xml:space="preserve"> be improved </w:t>
+            </w:r>
+            <w:proofErr w:type="gramStart"/>
+            <w:r>
+              <w:rPr>
+                <w:sz w:val="20"/>
+                <w:szCs w:val="20"/>
+                <w:lang w:val="en-AU"/>
+              </w:rPr>
+              <w:t>in order to</w:t>
+            </w:r>
+            <w:proofErr w:type="gramEnd"/>
+            <w:r>
+              <w:rPr>
+                <w:sz w:val="20"/>
+                <w:szCs w:val="20"/>
+                <w:lang w:val="en-AU"/>
+              </w:rPr>
+              <w:t xml:space="preserve"> handle edge cases, and make sure it fully </w:t>
+            </w:r>
+            <w:proofErr w:type="gramStart"/>
+            <w:r>
+              <w:rPr>
+                <w:sz w:val="20"/>
+                <w:szCs w:val="20"/>
+                <w:lang w:val="en-AU"/>
+              </w:rPr>
+              <w:t>follow</w:t>
+            </w:r>
+            <w:proofErr w:type="gramEnd"/>
+            <w:r>
+              <w:rPr>
+                <w:sz w:val="20"/>
+                <w:szCs w:val="20"/>
+                <w:lang w:val="en-AU"/>
+              </w:rPr>
+              <w:t xml:space="preserve"> the spec given in the doc and in the BB announcement.</w:t>
+            </w:r>
           </w:p>
         </w:tc>
       </w:tr>
@@ -2760,8 +4217,8 @@
         <w:tblLook w:val="04A0" w:firstRow="1" w:lastRow="0" w:firstColumn="1" w:lastColumn="0" w:noHBand="0" w:noVBand="1"/>
       </w:tblPr>
       <w:tblGrid>
-        <w:gridCol w:w="2404"/>
-        <w:gridCol w:w="4931"/>
+        <w:gridCol w:w="2337"/>
+        <w:gridCol w:w="4998"/>
       </w:tblGrid>
       <w:tr>
         <w:tc>
@@ -2836,7 +4293,15 @@
                 <w:szCs w:val="20"/>
                 <w:lang w:val="en-AU"/>
               </w:rPr>
-              <w:t xml:space="preserve"> requirements, </w:t>
+              <w:t xml:space="preserve"> </w:t>
+            </w:r>
+            <w:r>
+              <w:rPr>
+                <w:sz w:val="20"/>
+                <w:szCs w:val="20"/>
+                <w:lang w:val="en-AU"/>
+              </w:rPr>
+              <w:t xml:space="preserve">requirements, </w:t>
             </w:r>
             <w:r>
               <w:rPr>
@@ -2872,6 +4337,32 @@
                 <w:lang w:val="en-AU"/>
               </w:rPr>
             </w:pPr>
+            <w:r>
+              <w:rPr>
+                <w:sz w:val="20"/>
+                <w:szCs w:val="20"/>
+                <w:lang w:val="en-AU"/>
+              </w:rPr>
+              <w:t xml:space="preserve">I checked this against the spec, my own understanding, previous implementation, old CLI code, </w:t>
+            </w:r>
+            <w:proofErr w:type="gramStart"/>
+            <w:r>
+              <w:rPr>
+                <w:sz w:val="20"/>
+                <w:szCs w:val="20"/>
+                <w:lang w:val="en-AU"/>
+              </w:rPr>
+              <w:t>and also</w:t>
+            </w:r>
+            <w:proofErr w:type="gramEnd"/>
+            <w:r>
+              <w:rPr>
+                <w:sz w:val="20"/>
+                <w:szCs w:val="20"/>
+                <w:lang w:val="en-AU"/>
+              </w:rPr>
+              <w:t xml:space="preserve"> explanation given by the teaching team in BB announcement. In addition, I also consult some points to the tutor during practicals, to make sure my understanding is correct. </w:t>
+            </w:r>
           </w:p>
         </w:tc>
       </w:tr>
@@ -2892,8 +4383,8 @@
         <w:tblLook w:val="04A0" w:firstRow="1" w:lastRow="0" w:firstColumn="1" w:lastColumn="0" w:noHBand="0" w:noVBand="1"/>
       </w:tblPr>
       <w:tblGrid>
-        <w:gridCol w:w="2350"/>
-        <w:gridCol w:w="4985"/>
+        <w:gridCol w:w="2297"/>
+        <w:gridCol w:w="5038"/>
       </w:tblGrid>
       <w:tr>
         <w:tc>
@@ -2955,6 +4446,48 @@
                 <w:lang w:val="en-AU"/>
               </w:rPr>
             </w:pPr>
+            <w:r>
+              <w:rPr>
+                <w:sz w:val="20"/>
+                <w:szCs w:val="20"/>
+                <w:lang w:val="en-AU"/>
+              </w:rPr>
+              <w:t xml:space="preserve">I examine all the conditions and order of importance </w:t>
+            </w:r>
+            <w:r>
+              <w:rPr>
+                <w:sz w:val="20"/>
+                <w:szCs w:val="20"/>
+                <w:lang w:val="en-AU"/>
+              </w:rPr>
+              <w:t xml:space="preserve">from the spec and from the explanation from the teaching team on </w:t>
+            </w:r>
+            <w:r>
+              <w:rPr>
+                <w:sz w:val="20"/>
+                <w:szCs w:val="20"/>
+                <w:lang w:val="en-AU"/>
+              </w:rPr>
+              <w:t xml:space="preserve">how to allocate students to desks </w:t>
+            </w:r>
+            <w:proofErr w:type="gramStart"/>
+            <w:r>
+              <w:rPr>
+                <w:sz w:val="20"/>
+                <w:szCs w:val="20"/>
+                <w:lang w:val="en-AU"/>
+              </w:rPr>
+              <w:t>in a given</w:t>
+            </w:r>
+            <w:proofErr w:type="gramEnd"/>
+            <w:r>
+              <w:rPr>
+                <w:sz w:val="20"/>
+                <w:szCs w:val="20"/>
+                <w:lang w:val="en-AU"/>
+              </w:rPr>
+              <w:t xml:space="preserve"> venue.</w:t>
+            </w:r>
           </w:p>
         </w:tc>
       </w:tr>
@@ -2975,8 +4508,8 @@
         <w:tblLook w:val="04A0" w:firstRow="1" w:lastRow="0" w:firstColumn="1" w:lastColumn="0" w:noHBand="0" w:noVBand="1"/>
       </w:tblPr>
       <w:tblGrid>
-        <w:gridCol w:w="2417"/>
-        <w:gridCol w:w="4918"/>
+        <w:gridCol w:w="2352"/>
+        <w:gridCol w:w="4983"/>
       </w:tblGrid>
       <w:tr>
         <w:tc>
@@ -3038,6 +4571,64 @@
                 <w:lang w:val="en-AU"/>
               </w:rPr>
             </w:pPr>
+            <w:r>
+              <w:rPr>
+                <w:sz w:val="20"/>
+                <w:szCs w:val="20"/>
+                <w:lang w:val="en-AU"/>
+              </w:rPr>
+              <w:t>AI was consistently so adamant that the desk algo from the old CLI code was already correct and I can just port the code into my code. I find it potentially misleading therefore I made sure about it by asking</w:t>
+            </w:r>
+            <w:r>
+              <w:rPr>
+                <w:sz w:val="20"/>
+                <w:szCs w:val="20"/>
+                <w:lang w:val="en-AU"/>
+              </w:rPr>
+              <w:t xml:space="preserve"> about it in ed</w:t>
+            </w:r>
+            <w:r>
+              <w:rPr>
+                <w:sz w:val="20"/>
+                <w:szCs w:val="20"/>
+                <w:lang w:val="en-AU"/>
+              </w:rPr>
+              <w:t xml:space="preserve"> </w:t>
+            </w:r>
+            <w:proofErr w:type="gramStart"/>
+            <w:r>
+              <w:rPr>
+                <w:sz w:val="20"/>
+                <w:szCs w:val="20"/>
+                <w:lang w:val="en-AU"/>
+              </w:rPr>
+              <w:t>and also</w:t>
+            </w:r>
+            <w:proofErr w:type="gramEnd"/>
+            <w:r>
+              <w:rPr>
+                <w:sz w:val="20"/>
+                <w:szCs w:val="20"/>
+                <w:lang w:val="en-AU"/>
+              </w:rPr>
+              <w:t xml:space="preserve"> decided to </w:t>
+            </w:r>
+            <w:r>
+              <w:rPr>
+                <w:sz w:val="20"/>
+                <w:szCs w:val="20"/>
+                <w:lang w:val="en-AU"/>
+              </w:rPr>
+              <w:t>make</w:t>
+            </w:r>
+            <w:r>
+              <w:rPr>
+                <w:sz w:val="20"/>
+                <w:szCs w:val="20"/>
+                <w:lang w:val="en-AU"/>
+              </w:rPr>
+              <w:t xml:space="preserve"> the unit tests first rather than the implementation.</w:t>
+            </w:r>
           </w:p>
         </w:tc>
       </w:tr>
@@ -3064,8 +4655,8 @@
         <w:tblLook w:val="04A0" w:firstRow="1" w:lastRow="0" w:firstColumn="1" w:lastColumn="0" w:noHBand="0" w:noVBand="1"/>
       </w:tblPr>
       <w:tblGrid>
-        <w:gridCol w:w="2311"/>
-        <w:gridCol w:w="5024"/>
+        <w:gridCol w:w="2254"/>
+        <w:gridCol w:w="5081"/>
       </w:tblGrid>
       <w:tr>
         <w:tc>
@@ -3127,6 +4718,65 @@
                 <w:lang w:val="en-AU"/>
               </w:rPr>
             </w:pPr>
+            <w:r>
+              <w:rPr>
+                <w:sz w:val="20"/>
+                <w:szCs w:val="20"/>
+                <w:lang w:val="en-AU"/>
+              </w:rPr>
+              <w:t xml:space="preserve">I modify almost </w:t>
+            </w:r>
+            <w:proofErr w:type="gramStart"/>
+            <w:r>
+              <w:rPr>
+                <w:sz w:val="20"/>
+                <w:szCs w:val="20"/>
+                <w:lang w:val="en-AU"/>
+              </w:rPr>
+              <w:t>all of</w:t>
+            </w:r>
+            <w:proofErr w:type="gramEnd"/>
+            <w:r>
+              <w:rPr>
+                <w:sz w:val="20"/>
+                <w:szCs w:val="20"/>
+                <w:lang w:val="en-AU"/>
+              </w:rPr>
+              <w:t xml:space="preserve"> the code given by the AI regarding this method as it was only trying to give example of how the logic should look like. But I accept some of the points it made, especially when it assessed my black box testing list, which had untested edge cases.</w:t>
+            </w:r>
+            <w:r>
+              <w:rPr>
+                <w:sz w:val="20"/>
+                <w:szCs w:val="20"/>
+                <w:lang w:val="en-AU"/>
+              </w:rPr>
+              <w:t xml:space="preserve"> Even though AI sometimes made wrong </w:t>
+            </w:r>
+            <w:r>
+              <w:rPr>
+                <w:sz w:val="20"/>
+                <w:szCs w:val="20"/>
+                <w:lang w:val="en-AU"/>
+              </w:rPr>
+              <w:lastRenderedPageBreak/>
+              <w:t xml:space="preserve">information, it helped me to think more critically by correcting it and </w:t>
+            </w:r>
+            <w:r>
+              <w:rPr>
+                <w:sz w:val="20"/>
+                <w:szCs w:val="20"/>
+                <w:lang w:val="en-AU"/>
+              </w:rPr>
+              <w:t xml:space="preserve">making me </w:t>
+            </w:r>
+            <w:r>
+              <w:rPr>
+                <w:sz w:val="20"/>
+                <w:szCs w:val="20"/>
+                <w:lang w:val="en-AU"/>
+              </w:rPr>
+              <w:t>asking questions.</w:t>
+            </w:r>
           </w:p>
         </w:tc>
       </w:tr>
@@ -3147,8 +4797,8 @@
         <w:tblLook w:val="04A0" w:firstRow="1" w:lastRow="0" w:firstColumn="1" w:lastColumn="0" w:noHBand="0" w:noVBand="1"/>
       </w:tblPr>
       <w:tblGrid>
-        <w:gridCol w:w="2381"/>
-        <w:gridCol w:w="4954"/>
+        <w:gridCol w:w="2329"/>
+        <w:gridCol w:w="5006"/>
       </w:tblGrid>
       <w:tr>
         <w:tc>
@@ -3192,7 +4842,17 @@
                 <w:szCs w:val="20"/>
                 <w:lang w:val="en-AU"/>
               </w:rPr>
-              <w:t>Why was this decision appropriate given your verification and checks?</w:t>
+              <w:t xml:space="preserve">Why was this decision appropriate given your </w:t>
+            </w:r>
+            <w:r>
+              <w:rPr>
+                <w:b/>
+                <w:bCs/>
+                <w:sz w:val="20"/>
+                <w:szCs w:val="20"/>
+                <w:lang w:val="en-AU"/>
+              </w:rPr>
+              <w:t>verification and checks?</w:t>
             </w:r>
           </w:p>
           <w:p>
@@ -3229,6 +4889,66 @@
                 <w:lang w:val="en-AU"/>
               </w:rPr>
             </w:pPr>
+            <w:r>
+              <w:rPr>
+                <w:sz w:val="20"/>
+                <w:szCs w:val="20"/>
+                <w:lang w:val="en-AU"/>
+              </w:rPr>
+              <w:t xml:space="preserve">I think this is appropriate because I only used AI to help me </w:t>
+            </w:r>
+            <w:r>
+              <w:rPr>
+                <w:sz w:val="20"/>
+                <w:szCs w:val="20"/>
+                <w:lang w:val="en-AU"/>
+              </w:rPr>
+              <w:t xml:space="preserve">discuss and </w:t>
+            </w:r>
+            <w:r>
+              <w:rPr>
+                <w:sz w:val="20"/>
+                <w:szCs w:val="20"/>
+                <w:lang w:val="en-AU"/>
+              </w:rPr>
+              <w:t xml:space="preserve">implement what I understand, and I reject all suggestions that I think is not correct. I believe this is fair since the most authoritative source of information in this case was the assignment spec, </w:t>
+            </w:r>
+            <w:proofErr w:type="gramStart"/>
+            <w:r>
+              <w:rPr>
+                <w:sz w:val="20"/>
+                <w:szCs w:val="20"/>
+                <w:lang w:val="en-AU"/>
+              </w:rPr>
+              <w:t>and also</w:t>
+            </w:r>
+            <w:proofErr w:type="gramEnd"/>
+            <w:r>
+              <w:rPr>
+                <w:sz w:val="20"/>
+                <w:szCs w:val="20"/>
+                <w:lang w:val="en-AU"/>
+              </w:rPr>
+              <w:t xml:space="preserve"> the information given by the teaching team during practicals or ed discussion. </w:t>
+            </w:r>
+            <w:proofErr w:type="gramStart"/>
+            <w:r>
+              <w:rPr>
+                <w:sz w:val="20"/>
+                <w:szCs w:val="20"/>
+                <w:lang w:val="en-AU"/>
+              </w:rPr>
+              <w:t>Therefore</w:t>
+            </w:r>
+            <w:proofErr w:type="gramEnd"/>
+            <w:r>
+              <w:rPr>
+                <w:sz w:val="20"/>
+                <w:szCs w:val="20"/>
+                <w:lang w:val="en-AU"/>
+              </w:rPr>
+              <w:t xml:space="preserve"> by this I can make sure that I tried my best to implement this logic based on the authoritative source, not AI.</w:t>
+            </w:r>
           </w:p>
         </w:tc>
       </w:tr>

</xml_diff>